<commit_message>
Correct W3C reference year in final report
</commit_message>
<xml_diff>
--- a/docs/03-submission/finalreport_ToHuynhMinhTien_250201095.docx
+++ b/docs/03-submission/finalreport_ToHuynhMinhTien_250201095.docx
@@ -83,7 +83,7 @@
         <w:pStyle w:val="FirstParagraph"/>
       </w:pPr>
       <w:r>
-        <w:t>Báo cáo tập trung vào ba nhóm: sinh viên đi theo nhóm cần nội dung ngắn, phụ huynh tham quan cùng gia đình cần tuyến theo thời lượng và người khiếm thị dùng trình đọc màn hình cần mô tả hiện vật không phụ thuộc vào camera. Đây là các giả định thiết kế vì chưa phỏng vấn hoặc kiểm thử ba nhóm. W3C khuyến nghị đưa người khuyết tật vào quá trình đánh giá khả năng tiếp cận.</w:t>
+        <w:t>Báo cáo tập trung vào ba nhóm: sinh viên đi theo nhóm cần nội dung ngắn, phụ huynh tham quan cùng gia đình cần tuyến theo thời lượng và người khiếm thị dùng trình đọc màn hình cần mô tả hiện vật không phụ thuộc vào camera. Đây là các giả định thiết kế vì chưa phỏng vấn hoặc kiểm thử ba nhóm. W3C WAI mô tả các rào cản tiếp cận (2024) và khuyến nghị mời người khuyết tật tham gia đánh giá (2020).</w:t>
       </w:r>
       <w:r/>
       <w:r/>
@@ -4274,7 +4274,7 @@
         <w:pStyle w:val="BodyText"/>
       </w:pPr>
       <w:r>
-        <w:t xml:space="preserve">W3C Web Accessibility Initiative (2024a), </w:t>
+        <w:t xml:space="preserve">W3C Web Accessibility Initiative (2024), </w:t>
       </w:r>
       <w:r>
         <w:rPr>
@@ -4303,7 +4303,7 @@
         <w:pStyle w:val="BodyText"/>
       </w:pPr>
       <w:r>
-        <w:t xml:space="preserve">W3C Web Accessibility Initiative (2024b), </w:t>
+        <w:t xml:space="preserve">W3C Web Accessibility Initiative (2020), </w:t>
       </w:r>
       <w:r>
         <w:rPr>

</xml_diff>

<commit_message>
Cite course slide collection in final report
</commit_message>
<xml_diff>
--- a/docs/03-submission/finalreport_ToHuynhMinhTien_250201095.docx
+++ b/docs/03-submission/finalreport_ToHuynhMinhTien_250201095.docx
@@ -365,7 +365,7 @@
         <w:pStyle w:val="FirstParagraph"/>
       </w:pPr>
       <w:r>
-        <w:t>Các bước UCD trong báo cáo gồm chân dung, kịch bản, yêu cầu, HTA, phác thảo và rà soát giao diện.</w:t>
+        <w:t>Quy trình UCD tham khảo bộ slide môn học (Vi Chí Thành, 2026), gồm chân dung, kịch bản, yêu cầu, HTA, phác thảo và rà soát giao diện.</w:t>
       </w:r>
     </w:p>
     <w:p>
@@ -4238,35 +4238,7 @@
         <w:pStyle w:val="BodyText"/>
       </w:pPr>
       <w:r>
-        <w:t xml:space="preserve">Vi Chi Thanh (2026a), </w:t>
-      </w:r>
-      <w:r>
-        <w:rPr>
-          <w:i/>
-          <w:iCs/>
-        </w:rPr>
-        <w:t>Week 2: Introduction to User-Centred Design Methods</w:t>
-      </w:r>
-      <w:r>
-        <w:t>. Tài liệu môn học, University of Information Technology và Birmingham City University.</w:t>
-      </w:r>
-    </w:p>
-    <w:p>
-      <w:pPr>
-        <w:pStyle w:val="BodyText"/>
-      </w:pPr>
-      <w:r>
-        <w:t xml:space="preserve">Vi Chi Thanh (2026b), </w:t>
-      </w:r>
-      <w:r>
-        <w:rPr>
-          <w:i/>
-          <w:iCs/>
-        </w:rPr>
-        <w:t>Week 3: Introduction to Accessibility and Inclusive Design</w:t>
-      </w:r>
-      <w:r>
-        <w:t>. Tài liệu môn học, University of Information Technology và Birmingham City University.</w:t>
+        <w:t>Vi Chí Thành (2026), bộ slide môn Tương tác người – máy, tài liệu giảng dạy do giảng viên cung cấp.</w:t>
       </w:r>
     </w:p>
     <w:p>

</xml_diff>

<commit_message>
Polish course slide reference
</commit_message>
<xml_diff>
--- a/docs/03-submission/finalreport_ToHuynhMinhTien_250201095.docx
+++ b/docs/03-submission/finalreport_ToHuynhMinhTien_250201095.docx
@@ -4238,7 +4238,16 @@
         <w:pStyle w:val="BodyText"/>
       </w:pPr>
       <w:r>
-        <w:t>Vi Chí Thành (2026), bộ slide môn Tương tác người – máy, tài liệu giảng dạy do giảng viên cung cấp.</w:t>
+        <w:t xml:space="preserve">Vi Chí Thành (2026), </w:t>
+      </w:r>
+      <w:r>
+        <w:rPr>
+          <w:i/>
+        </w:rPr>
+        <w:t>Tương tác người – máy</w:t>
+      </w:r>
+      <w:r>
+        <w:t xml:space="preserve"> [bộ slide bài giảng]. Trường Đại học Công nghệ Thông tin, Đại học Quốc gia Thành phố Hồ Chí Minh.</w:t>
       </w:r>
     </w:p>
     <w:p>

</xml_diff>

<commit_message>
List course slides in final references
</commit_message>
<xml_diff>
--- a/docs/03-submission/finalreport_ToHuynhMinhTien_250201095.docx
+++ b/docs/03-submission/finalreport_ToHuynhMinhTien_250201095.docx
@@ -4247,7 +4247,133 @@
         <w:t>Tương tác người – máy</w:t>
       </w:r>
       <w:r>
-        <w:t xml:space="preserve"> [bộ slide bài giảng]. Trường Đại học Công nghệ Thông tin, Đại học Quốc gia Thành phố Hồ Chí Minh.</w:t>
+        <w:t xml:space="preserve"> [bộ slide bài giảng]. Trường Đại học Công nghệ Thông tin, ĐHQG-HCM. Các bài giảng:</w:t>
+      </w:r>
+    </w:p>
+    <w:p>
+      <w:pPr>
+        <w:pStyle w:val="BodyText"/>
+        <w:ind w:left="454" w:hanging="198"/>
+      </w:pPr>
+      <w:r>
+        <w:t xml:space="preserve">• Tuần 1: </w:t>
+      </w:r>
+      <w:r>
+        <w:rPr>
+          <w:i/>
+        </w:rPr>
+        <w:t>What is HCI</w:t>
+      </w:r>
+      <w:r>
+        <w:t>.</w:t>
+      </w:r>
+    </w:p>
+    <w:p>
+      <w:pPr>
+        <w:pStyle w:val="BodyText"/>
+        <w:ind w:left="454" w:hanging="198"/>
+      </w:pPr>
+      <w:r>
+        <w:t xml:space="preserve">• Tuần 2: </w:t>
+      </w:r>
+      <w:r>
+        <w:rPr>
+          <w:i/>
+        </w:rPr>
+        <w:t>Introduction to User-Centred Design Methods</w:t>
+      </w:r>
+      <w:r>
+        <w:t>.</w:t>
+      </w:r>
+    </w:p>
+    <w:p>
+      <w:pPr>
+        <w:pStyle w:val="BodyText"/>
+        <w:ind w:left="454" w:hanging="198"/>
+      </w:pPr>
+      <w:r>
+        <w:t xml:space="preserve">• Tuần 3: </w:t>
+      </w:r>
+      <w:r>
+        <w:rPr>
+          <w:i/>
+        </w:rPr>
+        <w:t>Introduction to Accessibility and Inclusive Design</w:t>
+      </w:r>
+      <w:r>
+        <w:t>.</w:t>
+      </w:r>
+    </w:p>
+    <w:p>
+      <w:pPr>
+        <w:pStyle w:val="BodyText"/>
+        <w:ind w:left="454" w:hanging="198"/>
+      </w:pPr>
+      <w:r>
+        <w:t xml:space="preserve">• Tuần 4: </w:t>
+      </w:r>
+      <w:r>
+        <w:rPr>
+          <w:i/>
+        </w:rPr>
+        <w:t>Interaction Design and Usability</w:t>
+      </w:r>
+      <w:r>
+        <w:t>.</w:t>
+      </w:r>
+    </w:p>
+    <w:p>
+      <w:pPr>
+        <w:pStyle w:val="BodyText"/>
+        <w:ind w:left="454" w:hanging="198"/>
+      </w:pPr>
+      <w:r>
+        <w:t xml:space="preserve">• Tuần 5: </w:t>
+      </w:r>
+      <w:r>
+        <w:rPr>
+          <w:i/>
+        </w:rPr>
+        <w:t>Information Architecture and Navigation Design</w:t>
+      </w:r>
+      <w:r>
+        <w:t>.</w:t>
+      </w:r>
+    </w:p>
+    <w:p>
+      <w:pPr>
+        <w:pStyle w:val="BodyText"/>
+        <w:ind w:left="454" w:hanging="198"/>
+      </w:pPr>
+      <w:r>
+        <w:t xml:space="preserve">• Tuần 6: </w:t>
+      </w:r>
+      <w:r>
+        <w:rPr>
+          <w:i/>
+        </w:rPr>
+        <w:t>Introduction to Visual Design Principles</w:t>
+      </w:r>
+      <w:r>
+        <w:t>.</w:t>
+      </w:r>
+    </w:p>
+    <w:p>
+      <w:pPr>
+        <w:pStyle w:val="BodyText"/>
+        <w:ind w:left="454" w:hanging="198"/>
+      </w:pPr>
+      <w:r>
+        <w:t xml:space="preserve">• Tuần 8 (tệp 07): </w:t>
+      </w:r>
+      <w:r>
+        <w:rPr>
+          <w:i/>
+        </w:rPr>
+        <w:t>User Testing and Evaluation Methods</w:t>
+      </w:r>
+      <w:r>
+        <w:t>.</w:t>
       </w:r>
     </w:p>
     <w:p>

</xml_diff>

<commit_message>
Cite each course slide separately
</commit_message>
<xml_diff>
--- a/docs/03-submission/finalreport_ToHuynhMinhTien_250201095.docx
+++ b/docs/03-submission/finalreport_ToHuynhMinhTien_250201095.docx
@@ -365,7 +365,7 @@
         <w:pStyle w:val="FirstParagraph"/>
       </w:pPr>
       <w:r>
-        <w:t>Quy trình UCD tham khảo bộ slide môn học (Vi Chí Thành, 2026), gồm chân dung, kịch bản, yêu cầu, HTA, phác thảo và rà soát giao diện.</w:t>
+        <w:t>Quy trình UCD tham khảo bộ slide môn học (Vi Chí Thành, 2026a–g), gồm chân dung, kịch bản, yêu cầu, HTA, phác thảo và rà soát giao diện.</w:t>
       </w:r>
     </w:p>
     <w:p>
@@ -4238,25 +4238,7 @@
         <w:pStyle w:val="BodyText"/>
       </w:pPr>
       <w:r>
-        <w:t xml:space="preserve">Vi Chí Thành (2026), </w:t>
-      </w:r>
-      <w:r>
-        <w:rPr>
-          <w:i/>
-        </w:rPr>
-        <w:t>Tương tác người – máy</w:t>
-      </w:r>
-      <w:r>
-        <w:t xml:space="preserve"> [bộ slide bài giảng]. Trường Đại học Công nghệ Thông tin, ĐHQG-HCM. Các bài giảng:</w:t>
-      </w:r>
-    </w:p>
-    <w:p>
-      <w:pPr>
-        <w:pStyle w:val="BodyText"/>
-        <w:ind w:left="454" w:hanging="198"/>
-      </w:pPr>
-      <w:r>
-        <w:t xml:space="preserve">• Tuần 1: </w:t>
+        <w:t xml:space="preserve">Vi Chí Thành (2026a), </w:t>
       </w:r>
       <w:r>
         <w:rPr>
@@ -4265,16 +4247,16 @@
         <w:t>What is HCI</w:t>
       </w:r>
       <w:r>
-        <w:t>.</w:t>
+        <w:t xml:space="preserve"> [slide tuần 1].</w:t>
       </w:r>
     </w:p>
     <w:p>
       <w:pPr>
         <w:pStyle w:val="BodyText"/>
-        <w:ind w:left="454" w:hanging="198"/>
-      </w:pPr>
-      <w:r>
-        <w:t xml:space="preserve">• Tuần 2: </w:t>
+        <w:ind/>
+      </w:pPr>
+      <w:r>
+        <w:t xml:space="preserve">Vi Chí Thành (2026b), </w:t>
       </w:r>
       <w:r>
         <w:rPr>
@@ -4283,16 +4265,16 @@
         <w:t>Introduction to User-Centred Design Methods</w:t>
       </w:r>
       <w:r>
-        <w:t>.</w:t>
+        <w:t xml:space="preserve"> [slide tuần 2].</w:t>
       </w:r>
     </w:p>
     <w:p>
       <w:pPr>
         <w:pStyle w:val="BodyText"/>
-        <w:ind w:left="454" w:hanging="198"/>
-      </w:pPr>
-      <w:r>
-        <w:t xml:space="preserve">• Tuần 3: </w:t>
+        <w:ind/>
+      </w:pPr>
+      <w:r>
+        <w:t xml:space="preserve">Vi Chí Thành (2026c), </w:t>
       </w:r>
       <w:r>
         <w:rPr>
@@ -4301,16 +4283,16 @@
         <w:t>Introduction to Accessibility and Inclusive Design</w:t>
       </w:r>
       <w:r>
-        <w:t>.</w:t>
+        <w:t xml:space="preserve"> [slide tuần 3].</w:t>
       </w:r>
     </w:p>
     <w:p>
       <w:pPr>
         <w:pStyle w:val="BodyText"/>
-        <w:ind w:left="454" w:hanging="198"/>
-      </w:pPr>
-      <w:r>
-        <w:t xml:space="preserve">• Tuần 4: </w:t>
+        <w:ind/>
+      </w:pPr>
+      <w:r>
+        <w:t xml:space="preserve">Vi Chí Thành (2026d), </w:t>
       </w:r>
       <w:r>
         <w:rPr>
@@ -4319,16 +4301,16 @@
         <w:t>Interaction Design and Usability</w:t>
       </w:r>
       <w:r>
-        <w:t>.</w:t>
+        <w:t xml:space="preserve"> [slide tuần 4].</w:t>
       </w:r>
     </w:p>
     <w:p>
       <w:pPr>
         <w:pStyle w:val="BodyText"/>
-        <w:ind w:left="454" w:hanging="198"/>
-      </w:pPr>
-      <w:r>
-        <w:t xml:space="preserve">• Tuần 5: </w:t>
+        <w:ind/>
+      </w:pPr>
+      <w:r>
+        <w:t xml:space="preserve">Vi Chí Thành (2026e), </w:t>
       </w:r>
       <w:r>
         <w:rPr>
@@ -4337,16 +4319,16 @@
         <w:t>Information Architecture and Navigation Design</w:t>
       </w:r>
       <w:r>
-        <w:t>.</w:t>
+        <w:t xml:space="preserve"> [slide tuần 5].</w:t>
       </w:r>
     </w:p>
     <w:p>
       <w:pPr>
         <w:pStyle w:val="BodyText"/>
-        <w:ind w:left="454" w:hanging="198"/>
-      </w:pPr>
-      <w:r>
-        <w:t xml:space="preserve">• Tuần 6: </w:t>
+        <w:ind/>
+      </w:pPr>
+      <w:r>
+        <w:t xml:space="preserve">Vi Chí Thành (2026f), </w:t>
       </w:r>
       <w:r>
         <w:rPr>
@@ -4355,16 +4337,16 @@
         <w:t>Introduction to Visual Design Principles</w:t>
       </w:r>
       <w:r>
-        <w:t>.</w:t>
+        <w:t xml:space="preserve"> [slide tuần 6].</w:t>
       </w:r>
     </w:p>
     <w:p>
       <w:pPr>
         <w:pStyle w:val="BodyText"/>
-        <w:ind w:left="454" w:hanging="198"/>
-      </w:pPr>
-      <w:r>
-        <w:t xml:space="preserve">• Tuần 8 (tệp 07): </w:t>
+        <w:ind/>
+      </w:pPr>
+      <w:r>
+        <w:t xml:space="preserve">Vi Chí Thành (2026g), </w:t>
       </w:r>
       <w:r>
         <w:rPr>
@@ -4373,7 +4355,7 @@
         <w:t>User Testing and Evaluation Methods</w:t>
       </w:r>
       <w:r>
-        <w:t>.</w:t>
+        <w:t xml:space="preserve"> [slide tuần 8].</w:t>
       </w:r>
     </w:p>
     <w:p>

</xml_diff>

<commit_message>
Format slide citations as individual course references
</commit_message>
<xml_diff>
--- a/docs/03-submission/finalreport_ToHuynhMinhTien_250201095.docx
+++ b/docs/03-submission/finalreport_ToHuynhMinhTien_250201095.docx
@@ -365,7 +365,7 @@
         <w:pStyle w:val="FirstParagraph"/>
       </w:pPr>
       <w:r>
-        <w:t>Quy trình UCD tham khảo bộ slide môn học (Vi Chí Thành, 2026a–g), gồm chân dung, kịch bản, yêu cầu, HTA, phác thảo và rà soát giao diện.</w:t>
+        <w:t>Quy trình UCD tham khảo bộ slide môn học (Vi Chi Thanh, 2026a–g), gồm chân dung, kịch bản, yêu cầu, HTA, phác thảo và rà soát giao diện.</w:t>
       </w:r>
     </w:p>
     <w:p>
@@ -4238,16 +4238,16 @@
         <w:pStyle w:val="BodyText"/>
       </w:pPr>
       <w:r>
-        <w:t xml:space="preserve">Vi Chí Thành (2026a), </w:t>
+        <w:t xml:space="preserve">Vi Chi Thanh (2026a), </w:t>
       </w:r>
       <w:r>
         <w:rPr>
           <w:i/>
         </w:rPr>
-        <w:t>What is HCI</w:t>
-      </w:r>
-      <w:r>
-        <w:t xml:space="preserve"> [slide tuần 1].</w:t>
+        <w:t>Week 1: What is HCI</w:t>
+      </w:r>
+      <w:r>
+        <w:t>. Tài liệu môn học, University of Information Technology.</w:t>
       </w:r>
     </w:p>
     <w:p>
@@ -4256,16 +4256,16 @@
         <w:ind/>
       </w:pPr>
       <w:r>
-        <w:t xml:space="preserve">Vi Chí Thành (2026b), </w:t>
+        <w:t xml:space="preserve">Vi Chi Thanh (2026b), </w:t>
       </w:r>
       <w:r>
         <w:rPr>
           <w:i/>
         </w:rPr>
-        <w:t>Introduction to User-Centred Design Methods</w:t>
-      </w:r>
-      <w:r>
-        <w:t xml:space="preserve"> [slide tuần 2].</w:t>
+        <w:t>Week 2: Introduction to User-Centred Design Methods</w:t>
+      </w:r>
+      <w:r>
+        <w:t>. Tài liệu môn học, University of Information Technology và Birmingham City University.</w:t>
       </w:r>
     </w:p>
     <w:p>
@@ -4274,16 +4274,16 @@
         <w:ind/>
       </w:pPr>
       <w:r>
-        <w:t xml:space="preserve">Vi Chí Thành (2026c), </w:t>
+        <w:t xml:space="preserve">Vi Chi Thanh (2026c), </w:t>
       </w:r>
       <w:r>
         <w:rPr>
           <w:i/>
         </w:rPr>
-        <w:t>Introduction to Accessibility and Inclusive Design</w:t>
-      </w:r>
-      <w:r>
-        <w:t xml:space="preserve"> [slide tuần 3].</w:t>
+        <w:t>Week 3: Introduction to Accessibility and Inclusive Design</w:t>
+      </w:r>
+      <w:r>
+        <w:t>. Tài liệu môn học, University of Information Technology và Birmingham City University.</w:t>
       </w:r>
     </w:p>
     <w:p>
@@ -4292,16 +4292,16 @@
         <w:ind/>
       </w:pPr>
       <w:r>
-        <w:t xml:space="preserve">Vi Chí Thành (2026d), </w:t>
+        <w:t xml:space="preserve">Vi Chi Thanh (2026d), </w:t>
       </w:r>
       <w:r>
         <w:rPr>
           <w:i/>
         </w:rPr>
-        <w:t>Interaction Design and Usability</w:t>
-      </w:r>
-      <w:r>
-        <w:t xml:space="preserve"> [slide tuần 4].</w:t>
+        <w:t>Week 4: Interaction Design and Usability</w:t>
+      </w:r>
+      <w:r>
+        <w:t>. Tài liệu môn học, University of Information Technology và Birmingham City University.</w:t>
       </w:r>
     </w:p>
     <w:p>
@@ -4310,16 +4310,16 @@
         <w:ind/>
       </w:pPr>
       <w:r>
-        <w:t xml:space="preserve">Vi Chí Thành (2026e), </w:t>
+        <w:t xml:space="preserve">Vi Chi Thanh (2026e), </w:t>
       </w:r>
       <w:r>
         <w:rPr>
           <w:i/>
         </w:rPr>
-        <w:t>Information Architecture and Navigation Design</w:t>
-      </w:r>
-      <w:r>
-        <w:t xml:space="preserve"> [slide tuần 5].</w:t>
+        <w:t>Week 5: Information Architecture and Navigation Design</w:t>
+      </w:r>
+      <w:r>
+        <w:t>. Tài liệu môn học, University of Information Technology và Birmingham City University.</w:t>
       </w:r>
     </w:p>
     <w:p>
@@ -4328,16 +4328,16 @@
         <w:ind/>
       </w:pPr>
       <w:r>
-        <w:t xml:space="preserve">Vi Chí Thành (2026f), </w:t>
+        <w:t xml:space="preserve">Vi Chi Thanh (2026f), </w:t>
       </w:r>
       <w:r>
         <w:rPr>
           <w:i/>
         </w:rPr>
-        <w:t>Introduction to Visual Design Principles</w:t>
-      </w:r>
-      <w:r>
-        <w:t xml:space="preserve"> [slide tuần 6].</w:t>
+        <w:t>Week 6: Introduction to Visual Design Principles</w:t>
+      </w:r>
+      <w:r>
+        <w:t>. Tài liệu môn học, International University, School of Computer Science and Engineering.</w:t>
       </w:r>
     </w:p>
     <w:p>
@@ -4346,16 +4346,16 @@
         <w:ind/>
       </w:pPr>
       <w:r>
-        <w:t xml:space="preserve">Vi Chí Thành (2026g), </w:t>
+        <w:t xml:space="preserve">Vi Chi Thanh (2026g), </w:t>
       </w:r>
       <w:r>
         <w:rPr>
           <w:i/>
         </w:rPr>
-        <w:t>User Testing and Evaluation Methods</w:t>
-      </w:r>
-      <w:r>
-        <w:t xml:space="preserve"> [slide tuần 8].</w:t>
+        <w:t>Week 8: User Testing and Evaluation Methods</w:t>
+      </w:r>
+      <w:r>
+        <w:t>. Tài liệu môn học, International University, School of Computer Science and Engineering.</w:t>
       </w:r>
     </w:p>
     <w:p>

</xml_diff>